<commit_message>
Update final_report.md and final_report.docx
- Polish and clarify the final report: remove the hardcoded live URL and note the Railway free trial ended (site no longer publicly hosted), tighten and reword the Introduction and Architecture sections, and standardize naming (Services / Predictions).
- Document known limitations (ZeroDivisionError in feature builder, mobile layout, deferred player stats) and update test-suite and results language to reflect the full passing suite.
- Simplify team role descriptions, adjust milestone wording, and make various formatting/grammar fixes.
- Also update the binary final_report.docx to match the Markdown changes.
</commit_message>
<xml_diff>
--- a/final_report.docx
+++ b/final_report.docx
@@ -84,30 +84,6 @@
     </w:p>
     <w:p>
       <w:pPr>
-        <w:spacing w:after="60"/>
-        <w:jc w:val="center"/>
-      </w:pPr>
-      <w:r>
-        <w:rPr>
-          <w:rFonts w:ascii="Arial" w:cs="Arial" w:eastAsia="Arial" w:hAnsi="Arial"/>
-          <w:b/>
-          <w:bCs/>
-          <w:sz w:val="22"/>
-          <w:szCs w:val="22"/>
-        </w:rPr>
-        <w:t xml:space="preserve">Live URL: </w:t>
-      </w:r>
-      <w:r>
-        <w:rPr>
-          <w:rFonts w:ascii="Arial" w:cs="Arial" w:eastAsia="Arial" w:hAnsi="Arial"/>
-          <w:sz w:val="22"/>
-          <w:szCs w:val="22"/>
-        </w:rPr>
-        <w:t xml:space="preserve">https://cs340-opencourt.up.railway.app/</w:t>
-      </w:r>
-    </w:p>
-    <w:p>
-      <w:pPr>
         <w:spacing w:after="320"/>
         <w:jc w:val="center"/>
       </w:pPr>
@@ -156,7 +132,7 @@
           <w:sz w:val="22"/>
           <w:szCs w:val="22"/>
         </w:rPr>
-        <w:t xml:space="preserve">OpenCourt Stats is a free, open-source college basketball (CBB) analytics dashboard built in Django. It pulls team, game, season-stat, and poll data from the CBBData API, presents that data through interactive visualizations, and uses an XGBoost classifier to predict outcomes for upcoming games. The site is publicly deployed on Railway with a Supabase Postgres database and is kept current by a daily incremental sync.</w:t>
+        <w:t xml:space="preserve">OpenCourt Stats is a free, open-source college basketball (CBB) analytics dashboard built in Django. It pulls team, game, season-stat, and poll data from the CBBData API, presents that data through interactive visualizations, and uses an XGBoost classifier to predict outcomes for upcoming games.</w:t>
       </w:r>
     </w:p>
     <w:p>
@@ -169,7 +145,7 @@
           <w:sz w:val="22"/>
           <w:szCs w:val="22"/>
         </w:rPr>
-        <w:t xml:space="preserve">The motivation was simple: the most analytically rigorous CBB sites (EvanMiya, CBB Analytics) hide their best content behind subscriptions, leaving casual fans with only surface-level metrics like points-per-game. We wanted to make advanced efficiency stats and forecasting freely available, with an interface fans can use without prior statistics training.</w:t>
+        <w:t xml:space="preserve">The motivation: the most analytically rigorous CBB sites (EvanMiya, CBB Analytics) hide advanced content behind subscriptions, leaving casual viewers with only surface-level metrics like points-per-game. We wanted to make advanced efficiency stats and forecasting freely available, with an interface usable without a statistics background.</w:t>
       </w:r>
     </w:p>
     <w:p>
@@ -182,7 +158,7 @@
           <w:sz w:val="22"/>
           <w:szCs w:val="22"/>
         </w:rPr>
-        <w:t xml:space="preserve">Our approach was to build a thin Django service over a Postgres mirror of the CBBData API: a sync layer pulls and normalizes data, six ORM models store it, seven class-based views render dashboards, and a separate predictions module loads a trained XGBoost model to forecast games. Tailwind v4 + DaisyUI v5 handle styling and ApexCharts handles visualizations.</w:t>
+        <w:t xml:space="preserve">Our approach was a thin Django service over a Postgres mirror of the CBBData API: a sync layer pulls and normalizes data, six ORM models store it, seven class-based views render dashboards, and a separate predictions module loads a trained XGBoost model. Tailwind v4 + DaisyUI v5 handle styling and ApexCharts handles visualizations.</w:t>
       </w:r>
     </w:p>
     <w:p>
@@ -195,7 +171,7 @@
           <w:sz w:val="22"/>
           <w:szCs w:val="22"/>
         </w:rPr>
-        <w:t xml:space="preserve">The only meaningful change from the proposal was the prediction stack: the proposal listed scikit-learn or PyTorch as candidates, but we settled on XGBoost after early experiments because the differential-feature design fit a gradient-boosted classifier better than either alternative. Player-level stats — a “nice to have” in the proposal’s descoping list — were not built. Everything in the “must have” and “should have” tiers shipped.</w:t>
+        <w:t xml:space="preserve">The only meaningful change from the proposal was the prediction stack: the proposal listed scikit-learn or PyTorch as candidates, but we shipped XGBoost because the differential-feature design fit a gradient-boosted classifier best. Player-level stats — a “nice to have” in the proposal’s descoping list — were not built.</w:t>
       </w:r>
     </w:p>
     <w:p>
@@ -218,7 +194,7 @@
           <w:sz w:val="22"/>
           <w:szCs w:val="22"/>
         </w:rPr>
-        <w:t xml:space="preserve">the project was a success. All MVP goals were met, the stretch-goal prediction model shipped and is live in production, and the application has been deployed at https://cs340-opencourt.up.railway.app/ since Sprint 4.</w:t>
+        <w:t xml:space="preserve">all MVP goals were met and the stretch-goal prediction model shipped. The project was deployed to Railway + Supabase for the duration of the class. The Railway free trial has since ended, so the public site is no longer live, but the application runs identically from a local checkout and the deployment configuration is preserved in the repository.</w:t>
       </w:r>
     </w:p>
     <w:p>
@@ -247,7 +223,7 @@
           <w:sz w:val="22"/>
           <w:szCs w:val="22"/>
         </w:rPr>
-        <w:t xml:space="preserve">Three changes from the proposal are worth recording.</w:t>
+        <w:t xml:space="preserve">Three changes from the proposal:</w:t>
       </w:r>
     </w:p>
     <w:p>
@@ -270,7 +246,7 @@
           <w:sz w:val="22"/>
           <w:szCs w:val="22"/>
         </w:rPr>
-        <w:t xml:space="preserve">The proposal proposed scikit-learn or PyTorch for the prediction model; we shipped an XGBoost classifier instead. </w:t>
+        <w:t xml:space="preserve">Proposal proposed scikit-learn or PyTorch; we shipped an XGBoost classifier instead. </w:t>
       </w:r>
       <w:r>
         <w:rPr>
@@ -288,7 +264,7 @@
           <w:sz w:val="22"/>
           <w:szCs w:val="22"/>
         </w:rPr>
-        <w:t xml:space="preserve">the differential-feature design (10-feature vector of paired stat deltas) is a natural fit for tree-based gradient boosting, and XGBoost gave better calibration than logistic regression in our early notebook trials with fewer hyperparameters to tune than a PyTorch network. </w:t>
+        <w:t xml:space="preserve">the 10-feature differential vector fits tree-based gradient boosting well, with better calibration than logistic regression and fewer hyperparameters than a PyTorch network. </w:t>
       </w:r>
       <w:r>
         <w:rPr>
@@ -306,7 +282,7 @@
           <w:sz w:val="22"/>
           <w:szCs w:val="22"/>
         </w:rPr>
-        <w:t xml:space="preserve">the customer-facing functionality is unchanged — users still get a binary home/away prediction — but the model trains faster and is easier to retrain as the season progresses.</w:t>
+        <w:t xml:space="preserve">user-facing functionality is unchanged — still a binary home/away prediction — but the model trains and retrains faster.</w:t>
       </w:r>
     </w:p>
     <w:p>
@@ -329,7 +305,7 @@
           <w:sz w:val="22"/>
           <w:szCs w:val="22"/>
         </w:rPr>
-        <w:t xml:space="preserve">The proposal described predictions surfacing on a generic team page; the final product instead exposes them through a dedicated /upcoming/ page that shows upcoming matchups with predictions and completed games with prediction accuracy alongside actual results. </w:t>
+        <w:t xml:space="preserve">Proposal described predictions surfacing on a team page; we instead built a dedicated /upcoming/ page that pairs predictions for upcoming games with prediction accuracy on completed games. </w:t>
       </w:r>
       <w:r>
         <w:rPr>
@@ -347,7 +323,7 @@
           <w:sz w:val="22"/>
           <w:szCs w:val="22"/>
         </w:rPr>
-        <w:t xml:space="preserve">user-testing inside the team showed that fans want a single page where they can scan predictions for the week, not hunt through team pages one at a time. </w:t>
+        <w:t xml:space="preserve">during internal team review, a single scannable page was clearly more useful than digging through individual team pages. </w:t>
       </w:r>
       <w:r>
         <w:rPr>
@@ -365,7 +341,7 @@
           <w:sz w:val="22"/>
           <w:szCs w:val="22"/>
         </w:rPr>
-        <w:t xml:space="preserve">the predictions feature feels first-class rather than buried, and post-hoc accuracy is now visible to users, which builds trust in the model.</w:t>
+        <w:t xml:space="preserve">predictions are first-class rather than buried, and accuracy is visible.</w:t>
       </w:r>
     </w:p>
     <w:p>
@@ -388,7 +364,7 @@
           <w:sz w:val="22"/>
           <w:szCs w:val="22"/>
         </w:rPr>
-        <w:t xml:space="preserve">The proposal listed player-level stats in the “nice to have” tier. They were not built. </w:t>
+        <w:t xml:space="preserve">Listed as “nice to have” in the proposal and not built. </w:t>
       </w:r>
       <w:r>
         <w:rPr>
@@ -406,7 +382,7 @@
           <w:sz w:val="22"/>
           <w:szCs w:val="22"/>
         </w:rPr>
-        <w:t xml:space="preserve">the CBBData API endpoints for player data require separate sync logic and roughly double our database footprint, and time was better spent hardening the prediction model and finishing deployment. </w:t>
+        <w:t xml:space="preserve">separate sync logic and roughly double the DB footprint; time was better spent on the model and the deployment. </w:t>
       </w:r>
       <w:r>
         <w:rPr>
@@ -424,7 +400,7 @@
           <w:sz w:val="22"/>
           <w:szCs w:val="22"/>
         </w:rPr>
-        <w:t xml:space="preserve">none for the MVP — the descoping plan explicitly anticipated this — but it is the most obvious next-iteration feature.</w:t>
+        <w:t xml:space="preserve">none for the MVP — descoping anticipated this — but it is the most obvious next-iteration feature.</w:t>
       </w:r>
     </w:p>
     <w:p>
@@ -469,7 +445,7 @@
           <w:sz w:val="22"/>
           <w:szCs w:val="22"/>
         </w:rPr>
-        <w:t xml:space="preserve">The system follows a standard layered Django architecture with a clearly separated data pipeline and prediction module:</w:t>
+        <w:t xml:space="preserve">Standard layered Django architecture with a separated data pipeline and prediction module:</w:t>
       </w:r>
     </w:p>
     <w:p>
@@ -539,7 +515,7 @@
           <w:sz w:val="18"/>
           <w:szCs w:val="18"/>
         </w:rPr>
-        <w:t xml:space="preserve">   |-- Views (7 CBVs)   -----&gt;  Templates (Jinja2)</w:t>
+        <w:t xml:space="preserve">   |-- Views (7 CBVs)  -----&gt;  Templates (Jinja2)</w:t>
       </w:r>
     </w:p>
     <w:p>
@@ -581,7 +557,7 @@
           <w:sz w:val="18"/>
           <w:szCs w:val="18"/>
         </w:rPr>
-        <w:t xml:space="preserve">   |-- Services layer (fetch.py / sync.py / update.py / helpers.py)</w:t>
+        <w:t xml:space="preserve">   |-- Services (fetch.py / sync.py / update.py / helpers.py)</w:t>
       </w:r>
     </w:p>
     <w:p>
@@ -595,7 +571,7 @@
           <w:sz w:val="18"/>
           <w:szCs w:val="18"/>
         </w:rPr>
-        <w:t xml:space="preserve">   |-- Predictions module (features.py / predict.py / model.py /</w:t>
+        <w:t xml:space="preserve">   |-- Predictions (features.py / predict.py / model.py /</w:t>
       </w:r>
     </w:p>
     <w:p>
@@ -609,7 +585,7 @@
           <w:sz w:val="18"/>
           <w:szCs w:val="18"/>
         </w:rPr>
-        <w:t xml:space="preserve">   |                       train_model.py / evaluate.py)</w:t>
+        <w:t xml:space="preserve">   |                train_model.py / evaluate.py)</w:t>
       </w:r>
     </w:p>
     <w:p>
@@ -651,7 +627,7 @@
           <w:sz w:val="18"/>
           <w:szCs w:val="18"/>
         </w:rPr>
-        <w:t xml:space="preserve">External: CBBData API   Database: SQLite (dev) / Supabase Postgres (prod)</w:t>
+        <w:t xml:space="preserve">External: CBBData API   Database: SQLite (dev) / Supabase Postgres</w:t>
       </w:r>
     </w:p>
     <w:p>
@@ -665,7 +641,7 @@
           <w:sz w:val="18"/>
           <w:szCs w:val="18"/>
         </w:rPr>
-        <w:t xml:space="preserve">Hosting: Railway        Static files: WhiteNoise        WSGI: Gunicorn</w:t>
+        <w:t xml:space="preserve">Hosting: Railway (now retired)   Static: WhiteNoise   WSGI: Gunicorn</w:t>
       </w:r>
     </w:p>
     <w:p>
@@ -688,7 +664,7 @@
           <w:sz w:val="22"/>
           <w:szCs w:val="22"/>
         </w:rPr>
-        <w:t xml:space="preserve">The architecture did not change meaningfully from the proposal. The two additions are (a) a dedicated predictions/ package separating ML code from app code, and (b) WhiteNoise + Gunicorn + Railway cron in the deployment layer, none of which were specified in the original proposal diagram.</w:t>
+        <w:t xml:space="preserve">The architecture did not change meaningfully from the proposal. Additions were a dedicated predictions/ package separating ML from app code, and a WhiteNoise + Gunicorn + Railway-cron deployment layer.</w:t>
       </w:r>
     </w:p>
     <w:p>
@@ -727,7 +703,7 @@
           <w:sz w:val="22"/>
           <w:szCs w:val="22"/>
         </w:rPr>
-        <w:t xml:space="preserve">services/fetch.py wraps the CBBData API with retry/backoff for 429 responses (honoring Retry-After). services/sync.py performs full backfills in foreign-key order (Conferences → Teams → Season Stats → Games → Game Team Stats → Rankings). services/update.py performs a daily 5-call incremental refresh of the most recent 30 days. Both are idempotent via update_or_create(), and both are exposed as Django management commands.</w:t>
+        <w:t xml:space="preserve">services/fetch.py wraps the CBBData API with retry/backoff for 429 responses. services/sync.py performs full backfills in foreign-key order. services/update.py performs a daily 5-call incremental refresh of the most recent 30 days. Both are idempotent via update_or_create() and exposed as Django management commands.</w:t>
       </w:r>
     </w:p>
     <w:p>
@@ -750,7 +726,7 @@
           <w:sz w:val="22"/>
           <w:szCs w:val="22"/>
         </w:rPr>
-        <w:t xml:space="preserve">predictions/features.py builds a 10-element differential feature vector for each matchup (effective FG%, turnover rate, point differential, pace, free-throw rate, offensive rating, blocks, offensive rebound %, assist-to-turnover ratio, home-court flag). predictions/predict.py loads a pickled XGBoost classifier from models/final_model/ (cached as a module-level singleton) and returns a home-win probability. The training pipeline is offline (train_model.py / evaluate.py) so the production app never trains, only predicts.</w:t>
+        <w:t xml:space="preserve">predictions/features.py builds a 10-element differential feature vector per matchup (effective FG%, turnover rate, point differential, pace, FT rate, offensive rating, blocks, ORB%, A:TO, home-court flag). predictions/predict.py loads a pickled XGBoost classifier (cached as a module-level singleton). Training is offline so the app only predicts.</w:t>
       </w:r>
     </w:p>
     <w:p>
@@ -773,7 +749,7 @@
           <w:sz w:val="22"/>
           <w:szCs w:val="22"/>
         </w:rPr>
-        <w:t xml:space="preserve">Seven class-based views cover the Home, About, Team list, Team detail, Conference list, Rankings, and Upcoming Games pages. Templates use DaisyUI components, with reusable fragments (team_card.html, conference_card.html, conference_filter.html) factored into templates/opencourt/components/. Chart rendering is per-page in extra_js blocks.</w:t>
+        <w:t xml:space="preserve">Seven CBVs cover Home, About, Team list, Team detail, Conference list, Rankings, and Upcoming Games. Reusable template fragments live in templates/opencourt/components/.</w:t>
       </w:r>
     </w:p>
     <w:p>
@@ -807,7 +783,7 @@
           <w:sz w:val="22"/>
           <w:szCs w:val="22"/>
         </w:rPr>
-        <w:t xml:space="preserve">All MVP pages render against live Supabase data (/, /teams/, /conferences/, /rankings/, /upcoming/, /&lt;slug&gt;/, /about/).</w:t>
+        <w:t xml:space="preserve">All MVP pages render against the synced database (/, /teams/, /conferences/, /rankings/, /upcoming/, /&lt;slug&gt;/, /about/).</w:t>
       </w:r>
     </w:p>
     <w:p>
@@ -825,7 +801,7 @@
           <w:sz w:val="22"/>
           <w:szCs w:val="22"/>
         </w:rPr>
-        <w:t xml:space="preserve">Daily incremental sync runs as a Railway cron job and keeps production data current.</w:t>
+        <w:t xml:space="preserve">Daily incremental sync runs cleanly via the update_data management command.</w:t>
       </w:r>
     </w:p>
     <w:p>
@@ -843,7 +819,7 @@
           <w:sz w:val="22"/>
           <w:szCs w:val="22"/>
         </w:rPr>
-        <w:t xml:space="preserve">The prediction model is integrated end-to-end: features → model → page render. Predictions appear on /upcoming/ for future games, and prediction accuracy is shown alongside actual results for completed games.</w:t>
+        <w:t xml:space="preserve">The prediction model is integrated end-to-end and surfaces predictions on /upcoming/ alongside prediction accuracy for completed games.</w:t>
       </w:r>
     </w:p>
     <w:p>
@@ -861,7 +837,7 @@
           <w:sz w:val="22"/>
           <w:szCs w:val="22"/>
         </w:rPr>
-        <w:t xml:space="preserve">Conference filtering, team search, week-by-week ranking navigation, and per-game expandable box scores all function on production.</w:t>
+        <w:t xml:space="preserve">Conference filtering, team search, week-by-week ranking navigation, and per-game expandable box scores all function correctly.</w:t>
       </w:r>
     </w:p>
     <w:p>
@@ -877,7 +853,7 @@
           <w:sz w:val="26"/>
           <w:szCs w:val="26"/>
         </w:rPr>
-        <w:t xml:space="preserve">What does not work / known limitations</w:t>
+        <w:t xml:space="preserve">What does not work</w:t>
       </w:r>
     </w:p>
     <w:p>
@@ -895,7 +871,7 @@
           <w:sz w:val="22"/>
           <w:szCs w:val="22"/>
         </w:rPr>
-        <w:t xml:space="preserve">build_features() in predictions/features.py has a documented ZeroDivisionError risk when off_possessions = 0. This case has not been observed in production data and is flagged in the test suite as a known bug.</w:t>
+        <w:t xml:space="preserve">build_features() has a documented ZeroDivisionError risk when off_possessions = 0; not observed in real data and flagged in the test suite.</w:t>
       </w:r>
     </w:p>
     <w:p>
@@ -913,7 +889,7 @@
           <w:sz w:val="22"/>
           <w:szCs w:val="22"/>
         </w:rPr>
-        <w:t xml:space="preserve">Player-level stats are not implemented (deferred per Section 2 above).</w:t>
+        <w:t xml:space="preserve">Player-level stats are not implemented (deferred per Section 2).</w:t>
       </w:r>
     </w:p>
     <w:p>
@@ -931,7 +907,25 @@
           <w:sz w:val="22"/>
           <w:szCs w:val="22"/>
         </w:rPr>
-        <w:t xml:space="preserve">Mobile layout polish on the /upcoming/ page lags the rest of the site at very narrow widths.</w:t>
+        <w:t xml:space="preserve">Mobile layout on /upcoming/ is rougher than the rest of the site at very narrow widths.</w:t>
+      </w:r>
+    </w:p>
+    <w:p>
+      <w:pPr>
+        <w:pStyle w:val="ListParagraph"/>
+        <w:numPr>
+          <w:ilvl w:val="0"/>
+          <w:numId w:val="2"/>
+        </w:numPr>
+        <w:spacing w:after="80"/>
+      </w:pPr>
+      <w:r>
+        <w:rPr>
+          <w:rFonts w:ascii="Arial" w:cs="Arial" w:eastAsia="Arial" w:hAnsi="Arial"/>
+          <w:sz w:val="22"/>
+          <w:szCs w:val="22"/>
+        </w:rPr>
+        <w:t xml:space="preserve">The site is no longer publicly accessible since the Railway free trial expired at the end of the class.</w:t>
       </w:r>
     </w:p>
     <w:p>
@@ -1070,7 +1064,7 @@
           <w:sz w:val="22"/>
           <w:szCs w:val="22"/>
         </w:rPr>
-        <w:t xml:space="preserve">We replaced the original 4-test stub with a full test suite organized by module: test_models.py, test_views.py, test_urls.py, test_stats.py, test_services.py, and test_predictions.py. The suite uses mock.patch to fake CBBData API calls in service tests and MagicMock to stub the XGBoost model in prediction tests, so the entire suite runs without network access or the model pickle file.</w:t>
+        <w:t xml:space="preserve">We replaced the original 4-test stub with a full test suite organized by module. The suite mocks CBBData API calls and the XGBoost model, so it runs without network access or the model pickle file.</w:t>
       </w:r>
     </w:p>
     <w:tbl>
@@ -1263,7 +1257,7 @@
                 <w:sz w:val="22"/>
                 <w:szCs w:val="22"/>
               </w:rPr>
-              <w:t xml:space="preserve">win_percentage() and point_differential() including zero-games and float-input edges</w:t>
+              <w:t xml:space="preserve">win_percentage(), point_differential(), zero-games and float-input edges</w:t>
             </w:r>
           </w:p>
         </w:tc>
@@ -1346,7 +1340,7 @@
                 <w:sz w:val="22"/>
                 <w:szCs w:val="22"/>
               </w:rPr>
-              <w:t xml:space="preserve">URL resolver for every public route + slug routing</w:t>
+              <w:t xml:space="preserve">URL resolution for every public route + slug routing</w:t>
             </w:r>
           </w:p>
         </w:tc>
@@ -1429,7 +1423,7 @@
                 <w:sz w:val="22"/>
                 <w:szCs w:val="22"/>
               </w:rPr>
-              <w:t xml:space="preserve">Every CBV: 200 responses, context keys, template choice, filter/search behavior</w:t>
+              <w:t xml:space="preserve">Every CBV: 200 responses, context keys, template choice, filter/search</w:t>
             </w:r>
           </w:p>
         </w:tc>
@@ -1512,7 +1506,7 @@
                 <w:sz w:val="22"/>
                 <w:szCs w:val="22"/>
               </w:rPr>
-              <w:t xml:space="preserve">Model __str__, slug auto-generation, FK constraints, default values</w:t>
+              <w:t xml:space="preserve">__str__, slug auto-generation, FK constraints, defaults</w:t>
             </w:r>
           </w:p>
         </w:tc>
@@ -1595,7 +1589,7 @@
                 <w:sz w:val="22"/>
                 <w:szCs w:val="22"/>
               </w:rPr>
-              <w:t xml:space="preserve">fetch.py retry/backoff with mocked 429s, sync.py update_or_create() paths, update.py window selection</w:t>
+              <w:t xml:space="preserve">fetch.py retry/backoff, sync.py upsert paths, update.py window selection</w:t>
             </w:r>
           </w:p>
         </w:tc>
@@ -1678,7 +1672,7 @@
                 <w:sz w:val="22"/>
                 <w:szCs w:val="22"/>
               </w:rPr>
-              <w:t xml:space="preserve">build_features() differential math, model-load singleton, make_predictions() error paths</w:t>
+              <w:t xml:space="preserve">build_features() math, model-load singleton, make_predictions() errors</w:t>
             </w:r>
           </w:p>
         </w:tc>
@@ -1714,7 +1708,7 @@
           <w:sz w:val="22"/>
           <w:szCs w:val="22"/>
         </w:rPr>
-        <w:t xml:space="preserve">the full suite passes. The TA evaluation on 2026-04-23 graded the test suite 38/40 on Automated Testing and called it “the strongest functional correctness submission in the class.” The one ZeroDivisionError noted above is the only known failing edge case, and it is documented in the test code rather than triggered in production.</w:t>
+        <w:t xml:space="preserve">the full suite passes. The only known failing edge case is the ZeroDivisionError noted above, which is documented in the test code rather than triggered in production.</w:t>
       </w:r>
     </w:p>
     <w:p>
@@ -1743,7 +1737,7 @@
           <w:sz w:val="22"/>
           <w:szCs w:val="22"/>
         </w:rPr>
-        <w:t xml:space="preserve">The four proposal roles stayed the same end-to-end. There was no rotation.</w:t>
+        <w:t xml:space="preserve">The four proposal roles stayed the same end-to-end. No rotation.</w:t>
       </w:r>
     </w:p>
     <w:tbl>
@@ -1936,7 +1930,7 @@
                 <w:sz w:val="22"/>
                 <w:szCs w:val="22"/>
               </w:rPr>
-              <w:t xml:space="preserve">Django architecture, models, all 7 views, deployment to Railway + Supabase, CI/PR review</w:t>
+              <w:t xml:space="preserve">Django architecture, models, all 7 views, deployment, PR review</w:t>
             </w:r>
           </w:p>
         </w:tc>
@@ -2019,7 +2013,7 @@
                 <w:sz w:val="22"/>
                 <w:szCs w:val="22"/>
               </w:rPr>
-              <w:t xml:space="preserve">All HTML templates, DaisyUI integration, responsive layout, component refactor</w:t>
+              <w:t xml:space="preserve">All HTML templates, DaisyUI integration, responsive layout</w:t>
             </w:r>
           </w:p>
         </w:tc>
@@ -2102,7 +2096,7 @@
                 <w:sz w:val="22"/>
                 <w:szCs w:val="22"/>
               </w:rPr>
-              <w:t xml:space="preserve">services/fetch.py, services/sync.py, services/update.py, all 7 management commands</w:t>
+              <w:t xml:space="preserve">services/ modules and all management commands</w:t>
             </w:r>
           </w:p>
         </w:tc>
@@ -2185,7 +2179,7 @@
                 <w:sz w:val="22"/>
                 <w:szCs w:val="22"/>
               </w:rPr>
-              <w:t xml:space="preserve">XGBoost model design and training, predictions/ module, feature engineering, evaluation</w:t>
+              <w:t xml:space="preserve">XGBoost model, predictions/ module, feature engineering, evaluation</w:t>
             </w:r>
           </w:p>
         </w:tc>
@@ -2211,7 +2205,7 @@
           <w:sz w:val="22"/>
           <w:szCs w:val="22"/>
         </w:rPr>
-        <w:t xml:space="preserve">Contributions were roughly equal in time invested. Kenneth and Jackson carried more total commits because their work (architecture, sync pipeline, management commands) cut across more files; Alex and Samuel produced fewer commits but each owned a self-contained, high-value surface (the entire UI, the entire ML pipeline). The team met twice a week, with backend/data pairing as needed during sync-pipeline integration in Sprint 2 and again during the predictions wiring in Sprint 4.</w:t>
+        <w:t xml:space="preserve">Contributions were roughly equal in time invested. Kenneth and Jackson carried more total commits because their work cut across more files; Alex and Samuel produced fewer commits but each owned a self-contained, high-value surface (the UI and the ML pipeline).</w:t>
       </w:r>
     </w:p>
     <w:p>
@@ -2240,7 +2234,7 @@
           <w:sz w:val="22"/>
           <w:szCs w:val="22"/>
         </w:rPr>
-        <w:t xml:space="preserve">We hit every milestone from the proposal schedule on or near its date:</w:t>
+        <w:t xml:space="preserve">We hit every milestone on or near its scheduled date:</w:t>
       </w:r>
     </w:p>
     <w:tbl>
@@ -2630,7 +2624,7 @@
                 <w:sz w:val="22"/>
                 <w:szCs w:val="22"/>
               </w:rPr>
-              <w:t xml:space="preserve">Team list, conference, team detail pages</w:t>
+              <w:t xml:space="preserve">Team / conference / detail pages</w:t>
             </w:r>
           </w:p>
         </w:tc>
@@ -3287,7 +3281,7 @@
           <w:sz w:val="22"/>
           <w:szCs w:val="22"/>
         </w:rPr>
-        <w:t xml:space="preserve">Two items in the proposal were intentionally not built: player-level stats and historical-trend pages beyond the per-team chart. Both were “nice to have” tier in the proposal’s descoping plan, and we descoped them in Sprint 4 to focus on test coverage and the production deploy — the right tradeoff in retrospect.</w:t>
+        <w:t xml:space="preserve">Player-level stats and historical-trend pages beyond the per-team chart were intentionally not built. Both were “nice to have” tier and descoped in Sprint 4 to make room for test coverage and deployment.</w:t>
       </w:r>
     </w:p>
     <w:p>
@@ -3300,7 +3294,7 @@
           <w:sz w:val="22"/>
           <w:szCs w:val="22"/>
         </w:rPr>
-        <w:t xml:space="preserve">The only goal we did not fully meet was the customer-side success metric “≥200 unique users during the March Madness window.” The site went live on Mar 31, after the tournament’s first weekend, so the realistic March Madness window was compressed to about a week. We did not formally collect usage analytics, so we cannot report on this metric one way or the other. All other proposal goals (model accuracy vs. baseline, MVP feature scope, production deployment, free public access with no paywall) were met.</w:t>
+        <w:t xml:space="preserve">The one goal we did not formally meet was the customer-side metric “≥200 unique users during the March Madness window.” The site went live on Mar 31, after the first weekend of the tournament, and we did not instrument usage analytics. All other proposal goals (model accuracy vs. baseline, MVP feature scope, production deployment, free public access) were met.</w:t>
       </w:r>
     </w:p>
     <w:p>
@@ -3360,7 +3354,7 @@
           <w:sz w:val="22"/>
           <w:szCs w:val="22"/>
         </w:rPr>
-        <w:t xml:space="preserve">Treating services/, predictions/, and management/commands/ as separate layers from day one paid off — the predictions module was added in Sprint 4 with no churn elsewhere in the codebase. The TA review specifically called out the test suite and documentation as the strongest in the class.</w:t>
+        <w:t xml:space="preserve">Treating services/, predictions/, and management/commands/ as separate layers from day one paid off — the predictions module was added in Sprint 4 with no churn elsewhere in the codebase.</w:t>
       </w:r>
     </w:p>
     <w:p>
@@ -3388,7 +3382,7 @@
           <w:sz w:val="22"/>
           <w:szCs w:val="22"/>
         </w:rPr>
-        <w:t xml:space="preserve">The proposal’s must/should/nice-to-have tiers turned out to be a load-bearing decision. When testing and deployment ran tight in Sprint 4, we had a pre-agreed list of what to cut (player stats, historical trends) and lost no time debating it.</w:t>
+        <w:t xml:space="preserve">The proposal’s must/should/nice-to-have tiers turned out to be load-bearing. When time ran tight in Sprint 4, we already had a pre-agreed list of what to cut and lost no time debating it.</w:t>
       </w:r>
     </w:p>
     <w:p>
@@ -3416,7 +3410,7 @@
           <w:sz w:val="22"/>
           <w:szCs w:val="22"/>
         </w:rPr>
-        <w:t xml:space="preserve">Going live on Railway + Supabase before the final sprint meant we shook out the real-world bugs (static files, secret management, cron timing) in time to fix them, and demoed against the live site rather than a localhost screenshot.</w:t>
+        <w:t xml:space="preserve">Going live before the final sprint meant we shook out real-world bugs (static files, secret management, cron timing) in time to fix them and demo against the live site rather than a localhost screenshot.</w:t>
       </w:r>
     </w:p>
     <w:p>
@@ -3432,7 +3426,7 @@
           <w:sz w:val="26"/>
           <w:szCs w:val="26"/>
         </w:rPr>
-        <w:t xml:space="preserve">What didn’t go as well</w:t>
+        <w:t xml:space="preserve">What didn’t go well</w:t>
       </w:r>
     </w:p>
     <w:p>
@@ -3460,7 +3454,7 @@
           <w:sz w:val="22"/>
           <w:szCs w:val="22"/>
         </w:rPr>
-        <w:t xml:space="preserve">Sprint 1–3 left us with four unit tests for one helper file. The full test suite was written in Sprint 4, which is much later than it should have been. It worked out — the suite ended up strong — but the team accepted real risk for several weeks by relying on manual testing.</w:t>
+        <w:t xml:space="preserve">Sprints 1–3 left us with four unit tests for one helper file. The full suite was written in Sprint 4 — much later than it should have been. The result worked out, but the team accepted real risk for several weeks by leaning on manual testing.</w:t>
       </w:r>
     </w:p>
     <w:p>
@@ -3480,15 +3474,15 @@
           <w:sz w:val="22"/>
           <w:szCs w:val="22"/>
         </w:rPr>
-        <w:t xml:space="preserve">No formal user feedback. </w:t>
-      </w:r>
-      <w:r>
-        <w:rPr>
-          <w:rFonts w:ascii="Arial" w:cs="Arial" w:eastAsia="Arial" w:hAnsi="Arial"/>
-          <w:sz w:val="22"/>
-          <w:szCs w:val="22"/>
-        </w:rPr>
-        <w:t xml:space="preserve">The proposal listed a survey-rating success metric, but we never ran a survey. We collected anecdotal feedback from CBB-fan friends, which informed the /upcoming/ page design, but nothing systematic.</w:t>
+        <w:t xml:space="preserve">No external user feedback. </w:t>
+      </w:r>
+      <w:r>
+        <w:rPr>
+          <w:rFonts w:ascii="Arial" w:cs="Arial" w:eastAsia="Arial" w:hAnsi="Arial"/>
+          <w:sz w:val="22"/>
+          <w:szCs w:val="22"/>
+        </w:rPr>
+        <w:t xml:space="preserve">The proposal listed a survey-rating success metric, but we only validated decisions internally within the team. No outside users were surveyed.</w:t>
       </w:r>
     </w:p>
     <w:p>
@@ -3508,15 +3502,15 @@
           <w:sz w:val="22"/>
           <w:szCs w:val="22"/>
         </w:rPr>
-        <w:t xml:space="preserve">Two-developer files. </w:t>
-      </w:r>
-      <w:r>
-        <w:rPr>
-          <w:rFonts w:ascii="Arial" w:cs="Arial" w:eastAsia="Arial" w:hAnsi="Arial"/>
-          <w:sz w:val="22"/>
-          <w:szCs w:val="22"/>
-        </w:rPr>
-        <w:t xml:space="preserve">views.py (1,379 lines) and models.py (710 lines) grew large enough that they should have been split by feature/domain. The early grading review flagged this and we did not refactor.</w:t>
+        <w:t xml:space="preserve">Oversized files. </w:t>
+      </w:r>
+      <w:r>
+        <w:rPr>
+          <w:rFonts w:ascii="Arial" w:cs="Arial" w:eastAsia="Arial" w:hAnsi="Arial"/>
+          <w:sz w:val="22"/>
+          <w:szCs w:val="22"/>
+        </w:rPr>
+        <w:t xml:space="preserve">views.py (~1,379 lines) and models.py (~710 lines) grew large enough that they should have been split by feature/domain. We did not refactor.</w:t>
       </w:r>
     </w:p>
     <w:p>
@@ -3545,7 +3539,7 @@
           <w:sz w:val="22"/>
           <w:szCs w:val="22"/>
         </w:rPr>
-        <w:t xml:space="preserve">Yes. We shipped a free, publicly accessible CBB analytics dashboard with advanced efficiency stats, interactive visualizations, weekly poll views, and a working prediction model — all within an 8-week sprint plan, deployed to production, with comprehensive test coverage and clean documentation. The product fulfills the core value proposition stated in the proposal: advanced college basketball analytics, free, no subscription, no account required. Everything in the proposal’s “must have” and “should have” tiers is live, the stretch-goal prediction model is integrated, and the codebase is in good enough shape to keep iterating after the semester ends.</w:t>
+        <w:t xml:space="preserve">Yes. We shipped a free CBB analytics dashboard with advanced efficiency stats, interactive visualizations, weekly poll views, and a working prediction model within an 8-week plan, deployed to production for the duration of the class, with comprehensive test coverage and clean documentation. Everything in the proposal’s “must have” and “should have” tiers is present, the stretch-goal prediction model is integrated, and the codebase is in good shape to keep iterating after the semester ends.</w:t>
       </w:r>
     </w:p>
     <w:sectPr>
@@ -3968,22 +3962,5 @@
       <w:szCs w:val="26"/>
     </w:rPr>
   </w:style>
-  <w:style w:type="paragraph" w:styleId="Heading3">
-    <w:name w:val="Heading 3"/>
-    <w:basedOn w:val="Normal"/>
-    <w:next w:val="Normal"/>
-    <w:qFormat/>
-    <w:pPr>
-      <w:spacing w:after="100" w:before="200"/>
-      <w:outlineLvl w:val="2"/>
-    </w:pPr>
-    <w:rPr>
-      <w:rFonts w:ascii="Arial" w:cs="Arial" w:eastAsia="Arial" w:hAnsi="Arial"/>
-      <w:b/>
-      <w:bCs/>
-      <w:sz w:val="23"/>
-      <w:szCs w:val="23"/>
-    </w:rPr>
-  </w:style>
 </w:styles>
 </file>
</xml_diff>